<commit_message>
Improve scheduler demo and layout
</commit_message>
<xml_diff>
--- a/outputs/SMA_Planning_Engine_Code_Study_Guide.docx
+++ b/outputs/SMA_Planning_Engine_Code_Study_Guide.docx
@@ -47,7 +47,7 @@
         <w:pStyle w:val="ListNumber"/>
       </w:pPr>
       <w:r>
-        <w:t>Start with Program.vb and LoginForm.vb to understand how the application opens.</w:t>
+        <w:t>Start with LoginForm.vb to understand how the application opens and validates login.</w:t>
       </w:r>
     </w:p>
     <w:p>
@@ -202,7 +202,7 @@
               <w:rPr>
                 <w:b w:val="0"/>
               </w:rPr>
-              <w:t>Program.vb, LoginForm.vb</w:t>
+              <w:t>LoginForm.vb</w:t>
             </w:r>
           </w:p>
         </w:tc>
@@ -220,7 +220,7 @@
               <w:rPr>
                 <w:b w:val="0"/>
               </w:rPr>
-              <w:t>Starts the app, checks username/password, then opens the planner form.</w:t>
+              <w:t>Starts the app, checks username/password, then opens the planner form directly from the login button success path.</w:t>
             </w:r>
           </w:p>
         </w:tc>
@@ -276,7 +276,7 @@
               <w:rPr>
                 <w:b w:val="0"/>
               </w:rPr>
-              <w:t>Searches SQL by Project ID, validates project metadata, then opens the scheduler.</w:t>
+              <w:t>Opens after login without touching SQL, then searches SQL by Project ID only when Schedule Project is clicked.</w:t>
             </w:r>
           </w:p>
         </w:tc>
@@ -635,7 +635,7 @@
           <w:color w:val="1F4E79"/>
           <w:sz w:val="18"/>
         </w:rPr>
-        <w:t>Program.Main -&gt; LoginForm -&gt; SMAPlannerForm -&gt; SQL Project ID lookup -&gt; SMASchedulerForm -&gt; SQL task templates -&gt; user edits -&gt; SaveProjectToSql -&gt; SqlProjectRepository.SaveProject</w:t>
+        <w:t>LoginForm.Main -&gt; LoginForm -&gt; successful Login button -&gt; SMAPlannerForm.ShowDialog() -&gt; user clicks Schedule Project -&gt; SQL Project ID lookup -&gt; SMASchedulerForm -&gt; SQL task templates -&gt; user edits -&gt; SaveProjectToSql -&gt; SqlProjectRepository.SaveProject</w:t>
       </w:r>
     </w:p>
     <w:p>
@@ -750,7 +750,7 @@
               <w:rPr>
                 <w:b w:val="0"/>
               </w:rPr>
-              <w:t>Program.vb</w:t>
+              <w:t>LoginForm.vb</w:t>
             </w:r>
           </w:p>
         </w:tc>
@@ -768,7 +768,7 @@
               <w:rPr>
                 <w:b w:val="0"/>
               </w:rPr>
-              <w:t>Enables WinForms visual styles, shows LoginForm, and opens SMAPlannerForm only when login succeeds.</w:t>
+              <w:t>Enables WinForms visual styles and starts the application with LoginForm. Program.vb was removed.</w:t>
             </w:r>
           </w:p>
         </w:tc>
@@ -824,7 +824,7 @@
               <w:rPr>
                 <w:b w:val="0"/>
               </w:rPr>
-              <w:t>Builds the login screen, centers it, sets Enter key to the Login button, and fills username with current Windows user.</w:t>
+              <w:t>Initializes the designer-built login controls, sets Enter key to the Login button, and fills username with current Windows user.</w:t>
             </w:r>
           </w:p>
         </w:tc>
@@ -881,6 +881,62 @@
                 <w:b w:val="0"/>
               </w:rPr>
               <w:t>Checks three rules: username is allowed, username matches the current Windows username, and password equals 12345.</w:t>
+            </w:r>
+          </w:p>
+        </w:tc>
+      </w:tr>
+      <w:tr>
+        <w:tc>
+          <w:tcPr>
+            <w:tcW w:type="dxa" w:w="2304"/>
+            <w:vAlign w:val="center"/>
+          </w:tcPr>
+          <w:p>
+            <w:pPr>
+              <w:spacing w:after="0"/>
+            </w:pPr>
+            <w:r/>
+            <w:r>
+              <w:rPr>
+                <w:b w:val="0"/>
+              </w:rPr>
+              <w:t>OpenPlannerForm</w:t>
+            </w:r>
+          </w:p>
+        </w:tc>
+        <w:tc>
+          <w:tcPr>
+            <w:tcW w:type="dxa" w:w="2016"/>
+            <w:vAlign w:val="center"/>
+          </w:tcPr>
+          <w:p>
+            <w:pPr>
+              <w:spacing w:after="0"/>
+            </w:pPr>
+            <w:r/>
+            <w:r>
+              <w:rPr>
+                <w:b w:val="0"/>
+              </w:rPr>
+              <w:t>LoginForm.vb</w:t>
+            </w:r>
+          </w:p>
+        </w:tc>
+        <w:tc>
+          <w:tcPr>
+            <w:tcW w:type="dxa" w:w="5040"/>
+            <w:vAlign w:val="center"/>
+          </w:tcPr>
+          <w:p>
+            <w:pPr>
+              <w:spacing w:after="0"/>
+            </w:pPr>
+            <w:r/>
+            <w:r>
+              <w:rPr>
+                <w:b w:val="0"/>
+              </w:rPr>
+              <w:t>Hides the login form, opens SMAPlannerForm with ShowDialog(), and closes the login form when planner closes.</w:t>
             </w:r>
           </w:p>
         </w:tc>
@@ -1014,7 +1070,7 @@
     </w:p>
     <w:p>
       <w:r>
-        <w:t>SMAPlannerForm is the first business screen. Its main job is to let the user type a Project ID and open the scheduler only when SQL has enough valid project data.</w:t>
+        <w:t>SMAPlannerForm is the first business screen after login. It opens without connecting to SQL. SQL is first used only when the user types a Project ID and clicks Schedule Project.</w:t>
       </w:r>
     </w:p>
     <w:tbl>
@@ -1083,7 +1139,7 @@
               <w:rPr>
                 <w:b w:val="0"/>
               </w:rPr>
-              <w:t>1. User enters Project ID</w:t>
+              <w:t>1. Login succeeds</w:t>
             </w:r>
           </w:p>
         </w:tc>
@@ -1101,7 +1157,7 @@
               <w:rPr>
                 <w:b w:val="0"/>
               </w:rPr>
-              <w:t>The Project ID is read from _liveProjectSearchBox.Text.</w:t>
+              <w:t>LoginForm hides itself and opens SMAPlannerForm.ShowDialog().</w:t>
             </w:r>
           </w:p>
         </w:tc>
@@ -1121,7 +1177,7 @@
               <w:rPr>
                 <w:b w:val="0"/>
               </w:rPr>
-              <w:t>2. SQL connection check</w:t>
+              <w:t>2. Planner opens with no SQL call</w:t>
             </w:r>
           </w:p>
         </w:tc>
@@ -1139,7 +1195,7 @@
               <w:rPr>
                 <w:b w:val="0"/>
               </w:rPr>
-              <w:t>If _sqlRepository is Nothing, the app shows a SQL configuration warning.</w:t>
+              <w:t>InitializePlannerWithoutSql clears the list, updates summary labels, and tells the user to enter a Project ID.</w:t>
             </w:r>
           </w:p>
         </w:tc>
@@ -1159,7 +1215,7 @@
               <w:rPr>
                 <w:b w:val="0"/>
               </w:rPr>
-              <w:t>3. Load project metadata</w:t>
+              <w:t>3. User enters Project ID</w:t>
             </w:r>
           </w:p>
         </w:tc>
@@ -1177,7 +1233,7 @@
               <w:rPr>
                 <w:b w:val="0"/>
               </w:rPr>
-              <w:t>GetProjectPlanningInfo(projectCode) reads Version_Table and Table_Project_Tracking.</w:t>
+              <w:t>The Project ID is read from _liveProjectSearchBox.Text only when Schedule Project is clicked.</w:t>
             </w:r>
           </w:p>
         </w:tc>
@@ -1197,7 +1253,7 @@
               <w:rPr>
                 <w:b w:val="0"/>
               </w:rPr>
-              <w:t>4. Stop if missing</w:t>
+              <w:t>4. SQL connection check</w:t>
             </w:r>
           </w:p>
         </w:tc>
@@ -1215,7 +1271,7 @@
               <w:rPr>
                 <w:b w:val="0"/>
               </w:rPr>
-              <w:t>If no project, missing project name, missing version, missing project size, invalid size, inactive project, or already planned, the scheduler does not open.</w:t>
+              <w:t>If _sqlRepository is Nothing, the app shows a SQL configuration warning.</w:t>
             </w:r>
           </w:p>
         </w:tc>
@@ -1235,7 +1291,7 @@
               <w:rPr>
                 <w:b w:val="0"/>
               </w:rPr>
-              <w:t>5. Build LiveProjectItem</w:t>
+              <w:t>5. Load project metadata</w:t>
             </w:r>
           </w:p>
         </w:tc>
@@ -1253,7 +1309,7 @@
               <w:rPr>
                 <w:b w:val="0"/>
               </w:rPr>
-              <w:t>The SQL metadata is copied into a LiveProjectItem, including version, size, report type, pointcloud, tech pack, deed profile, shadow analysis, urgent small project.</w:t>
+              <w:t>GetProjectPlanningInfo(projectCode) reads Version_Table and Table_Project_Tracking.</w:t>
             </w:r>
           </w:p>
         </w:tc>
@@ -1273,7 +1329,83 @@
               <w:rPr>
                 <w:b w:val="0"/>
               </w:rPr>
-              <w:t>6. Open scheduler</w:t>
+              <w:t>6. Stop if missing</w:t>
+            </w:r>
+          </w:p>
+        </w:tc>
+        <w:tc>
+          <w:tcPr>
+            <w:tcW w:type="dxa" w:w="6768"/>
+            <w:vAlign w:val="center"/>
+          </w:tcPr>
+          <w:p>
+            <w:pPr>
+              <w:spacing w:after="0"/>
+            </w:pPr>
+            <w:r/>
+            <w:r>
+              <w:rPr>
+                <w:b w:val="0"/>
+              </w:rPr>
+              <w:t>If no project, missing project name, missing version, missing project size, invalid size, inactive project, or already planned, the scheduler does not open.</w:t>
+            </w:r>
+          </w:p>
+        </w:tc>
+      </w:tr>
+      <w:tr>
+        <w:tc>
+          <w:tcPr>
+            <w:tcW w:type="dxa" w:w="2592"/>
+            <w:vAlign w:val="center"/>
+          </w:tcPr>
+          <w:p>
+            <w:pPr>
+              <w:spacing w:after="0"/>
+            </w:pPr>
+            <w:r/>
+            <w:r>
+              <w:rPr>
+                <w:b w:val="0"/>
+              </w:rPr>
+              <w:t>7. Build LiveProjectItem</w:t>
+            </w:r>
+          </w:p>
+        </w:tc>
+        <w:tc>
+          <w:tcPr>
+            <w:tcW w:type="dxa" w:w="6768"/>
+            <w:vAlign w:val="center"/>
+          </w:tcPr>
+          <w:p>
+            <w:pPr>
+              <w:spacing w:after="0"/>
+            </w:pPr>
+            <w:r/>
+            <w:r>
+              <w:rPr>
+                <w:b w:val="0"/>
+              </w:rPr>
+              <w:t>The SQL metadata is copied into a LiveProjectItem, including version, size, report type, pointcloud, tech pack, deed profile, shadow analysis, urgent small project.</w:t>
+            </w:r>
+          </w:p>
+        </w:tc>
+      </w:tr>
+      <w:tr>
+        <w:tc>
+          <w:tcPr>
+            <w:tcW w:type="dxa" w:w="2592"/>
+            <w:vAlign w:val="center"/>
+          </w:tcPr>
+          <w:p>
+            <w:pPr>
+              <w:spacing w:after="0"/>
+            </w:pPr>
+            <w:r/>
+            <w:r>
+              <w:rPr>
+                <w:b w:val="0"/>
+              </w:rPr>
+              <w:t>8. Open scheduler</w:t>
             </w:r>
           </w:p>
         </w:tc>
@@ -1391,6 +1523,44 @@
                 <w:b w:val="0"/>
               </w:rPr>
               <w:t>Main Schedule Project button handler. Validates SQL data and opens scheduler.</w:t>
+            </w:r>
+          </w:p>
+        </w:tc>
+      </w:tr>
+      <w:tr>
+        <w:tc>
+          <w:tcPr>
+            <w:tcW w:type="dxa" w:w="3168"/>
+            <w:vAlign w:val="center"/>
+          </w:tcPr>
+          <w:p>
+            <w:pPr>
+              <w:spacing w:after="0"/>
+            </w:pPr>
+            <w:r/>
+            <w:r>
+              <w:rPr>
+                <w:b w:val="0"/>
+              </w:rPr>
+              <w:t>InitializePlannerWithoutSql</w:t>
+            </w:r>
+          </w:p>
+        </w:tc>
+        <w:tc>
+          <w:tcPr>
+            <w:tcW w:type="dxa" w:w="6192"/>
+            <w:vAlign w:val="center"/>
+          </w:tcPr>
+          <w:p>
+            <w:pPr>
+              <w:spacing w:after="0"/>
+            </w:pPr>
+            <w:r/>
+            <w:r>
+              <w:rPr>
+                <w:b w:val="0"/>
+              </w:rPr>
+              <w:t>Opens Planner after login without connecting to SQL. Shows an instruction status message.</w:t>
             </w:r>
           </w:p>
         </w:tc>
@@ -7507,7 +7677,7 @@
               <w:rPr>
                 <w:b w:val="0"/>
               </w:rPr>
-              <w:t>Program.vb</w:t>
+              <w:t>LoginForm.vb</w:t>
             </w:r>
           </w:p>
         </w:tc>
@@ -7525,7 +7695,7 @@
               <w:rPr>
                 <w:b w:val="0"/>
               </w:rPr>
-              <w:t>Small and easy; shows app entry point.</w:t>
+              <w:t>Shows the app entry point, login rules, button/Enter behavior, and opening SMAPlannerForm.</w:t>
             </w:r>
           </w:p>
         </w:tc>
@@ -7563,7 +7733,7 @@
               <w:rPr>
                 <w:b w:val="0"/>
               </w:rPr>
-              <w:t>LoginForm.vb</w:t>
+              <w:t>SMAPlannerForm.vb</w:t>
             </w:r>
           </w:p>
         </w:tc>
@@ -7581,7 +7751,7 @@
               <w:rPr>
                 <w:b w:val="0"/>
               </w:rPr>
-              <w:t>Shows login rules and button/Enter behavior.</w:t>
+              <w:t>Shows delayed SQL loading, Project ID validation, and opening scheduler.</w:t>
             </w:r>
           </w:p>
         </w:tc>
@@ -7619,7 +7789,7 @@
               <w:rPr>
                 <w:b w:val="0"/>
               </w:rPr>
-              <w:t>SMAPlannerForm.vb</w:t>
+              <w:t>SMAPlannerForm.Designer.vb</w:t>
             </w:r>
           </w:p>
         </w:tc>
@@ -7637,7 +7807,7 @@
               <w:rPr>
                 <w:b w:val="0"/>
               </w:rPr>
-              <w:t>Shows Project ID SQL validation and opening scheduler.</w:t>
+              <w:t>Shows planner UI controls and grid columns in designer-backed code.</w:t>
             </w:r>
           </w:p>
         </w:tc>
@@ -8383,6 +8553,54 @@
       </w:tr>
     </w:tbl>
     <w:p/>
+    <w:p>
+      <w:pPr>
+        <w:pStyle w:val="Heading2"/>
+      </w:pPr>
+      <w:r>
+        <w:t>Current Startup Notes</w:t>
+      </w:r>
+    </w:p>
+    <w:p>
+      <w:pPr>
+        <w:pStyle w:val="ListBullet"/>
+      </w:pPr>
+      <w:r>
+        <w:t>Program.vb has been removed.</w:t>
+      </w:r>
+    </w:p>
+    <w:p>
+      <w:pPr>
+        <w:pStyle w:val="ListBullet"/>
+      </w:pPr>
+      <w:r>
+        <w:t>The project startup object is SMAScheduler.LoginForm.</w:t>
+      </w:r>
+    </w:p>
+    <w:p>
+      <w:pPr>
+        <w:pStyle w:val="ListBullet"/>
+      </w:pPr>
+      <w:r>
+        <w:t>LoginForm.Main starts the application with Application.Run(New LoginForm()).</w:t>
+      </w:r>
+    </w:p>
+    <w:p>
+      <w:pPr>
+        <w:pStyle w:val="ListBullet"/>
+      </w:pPr>
+      <w:r>
+        <w:t>Successful login calls SMAPlannerForm.ShowDialog() from LoginForm.vb.</w:t>
+      </w:r>
+    </w:p>
+    <w:p>
+      <w:pPr>
+        <w:pStyle w:val="ListBullet"/>
+      </w:pPr>
+      <w:r>
+        <w:t>SMAPlannerForm no longer loads SQL on form startup; SQL starts when Schedule Project is clicked.</w:t>
+      </w:r>
+    </w:p>
     <w:p>
       <w:pPr>
         <w:pStyle w:val="Heading1"/>

</xml_diff>